<commit_message>
Patch Chapter 25 specification gaps
</commit_message>
<xml_diff>
--- a/docs/מסמך_עיצוב_טכני_UAT (1).docx
+++ b/docs/מסמך_עיצוב_טכני_UAT (1).docx
@@ -7340,7 +7340,7 @@
                 <w:sz w:val="19"/>
                 <w:szCs w:val="19"/>
               </w:rPr>
-              <w:t xml:space="preserve">אצווה שפג תוקפה, כמות מעל הסף הדורש אישור מנהל/ת נוסף</w:t>
+              <w:t xml:space="preserve">אצווה שפג תוקפה, כמות מעל הסף הדורש אישור מנהל מערכת נוסף</w:t>
             </w:r>
           </w:p>
         </w:tc>
@@ -13383,6 +13383,1204 @@
           <w:szCs w:val="22"/>
         </w:rPr>
         <w:t xml:space="preserve">Pass אך ורק אם: (א) החריגה עצמה לא נחסמה כשגיאת API; (ב) הניתוב היה למנהל ייצור ולא למנהלת אבטחת איכות; (ג) שתי הבקשות השליליות (ללא נימוק, וניסיון re-freeze) נחסמו כל אחת. כשל בכל אחד משלושת התנאים = Fail.</w:t>
+      </w:r>
+    </w:p>
+    <w:tbl>
+      <w:tblPr>
+        <w:tblW w:type="dxa" w:w="8800"/>
+        <w:tblBorders>
+          <w:top w:val="single" w:color="auto" w:sz="4"/>
+          <w:left w:val="single" w:color="auto" w:sz="4"/>
+          <w:bottom w:val="single" w:color="auto" w:sz="4"/>
+          <w:right w:val="single" w:color="auto" w:sz="4"/>
+          <w:insideH w:val="single" w:color="auto" w:sz="4"/>
+          <w:insideV w:val="single" w:color="auto" w:sz="4"/>
+        </w:tblBorders>
+      </w:tblPr>
+      <w:tblGrid>
+        <w:gridCol w:w="2200"/>
+        <w:gridCol w:w="6600"/>
+      </w:tblGrid>
+      <w:tr>
+        <w:tc>
+          <w:tcPr>
+            <w:tcW w:type="dxa" w:w="2200"/>
+            <w:shd w:fill="555555" w:val="clear"/>
+            <w:tcMar>
+              <w:top w:type="dxa" w:w="60"/>
+              <w:left w:type="dxa" w:w="90"/>
+              <w:bottom w:type="dxa" w:w="60"/>
+              <w:right w:type="dxa" w:w="90"/>
+            </w:tcMar>
+            <w:vAlign w:val="center"/>
+          </w:tcPr>
+          <w:p>
+            <w:pPr>
+              <w:bidi/>
+              <w:spacing w:after="0"/>
+              <w:jc w:val="right"/>
+            </w:pPr>
+            <w:r>
+              <w:rPr>
+                <w:rFonts w:ascii="Arial" w:cs="Arial" w:eastAsia="Arial" w:hAnsi="Arial"/>
+                <w:b/>
+                <w:bCs/>
+                <w:color w:val="FFFFFF"/>
+                <w:sz w:val="19"/>
+                <w:szCs w:val="19"/>
+              </w:rPr>
+              <w:t xml:space="preserve">תוצאה בפועל</w:t>
+            </w:r>
+          </w:p>
+        </w:tc>
+        <w:tc>
+          <w:tcPr>
+            <w:tcW w:type="dxa" w:w="6600"/>
+            <w:tcMar>
+              <w:top w:type="dxa" w:w="60"/>
+              <w:left w:type="dxa" w:w="90"/>
+              <w:bottom w:type="dxa" w:w="60"/>
+              <w:right w:type="dxa" w:w="90"/>
+            </w:tcMar>
+            <w:vAlign w:val="center"/>
+          </w:tcPr>
+          <w:p>
+            <w:pPr>
+              <w:bidi/>
+              <w:spacing w:after="0"/>
+              <w:jc w:val="right"/>
+            </w:pPr>
+            <w:r>
+              <w:rPr>
+                <w:rFonts w:ascii="Arial" w:cs="Arial" w:eastAsia="Arial" w:hAnsi="Arial"/>
+                <w:b w:val="false"/>
+                <w:bCs w:val="false"/>
+                <w:sz w:val="19"/>
+                <w:szCs w:val="19"/>
+              </w:rPr>
+              <w:t xml:space="preserve">☐ Pass   ☐ Fail   |   הערות: ___________________________</w:t>
+            </w:r>
+          </w:p>
+        </w:tc>
+      </w:tr>
+      <w:tr>
+        <w:tc>
+          <w:tcPr>
+            <w:tcW w:type="dxa" w:w="2200"/>
+            <w:shd w:fill="555555" w:val="clear"/>
+            <w:tcMar>
+              <w:top w:type="dxa" w:w="60"/>
+              <w:left w:type="dxa" w:w="90"/>
+              <w:bottom w:type="dxa" w:w="60"/>
+              <w:right w:type="dxa" w:w="90"/>
+            </w:tcMar>
+            <w:vAlign w:val="center"/>
+          </w:tcPr>
+          <w:p>
+            <w:pPr>
+              <w:bidi/>
+              <w:spacing w:after="0"/>
+              <w:jc w:val="right"/>
+            </w:pPr>
+            <w:r>
+              <w:rPr>
+                <w:rFonts w:ascii="Arial" w:cs="Arial" w:eastAsia="Arial" w:hAnsi="Arial"/>
+                <w:b/>
+                <w:bCs/>
+                <w:color w:val="FFFFFF"/>
+                <w:sz w:val="19"/>
+                <w:szCs w:val="19"/>
+              </w:rPr>
+              <w:t xml:space="preserve">נבדק ע"י / תאריך</w:t>
+            </w:r>
+          </w:p>
+        </w:tc>
+        <w:tc>
+          <w:tcPr>
+            <w:tcW w:type="dxa" w:w="6600"/>
+            <w:tcMar>
+              <w:top w:type="dxa" w:w="60"/>
+              <w:left w:type="dxa" w:w="90"/>
+              <w:bottom w:type="dxa" w:w="60"/>
+              <w:right w:type="dxa" w:w="90"/>
+            </w:tcMar>
+            <w:vAlign w:val="center"/>
+          </w:tcPr>
+          <w:p>
+            <w:pPr>
+              <w:bidi/>
+              <w:spacing w:after="0"/>
+              <w:jc w:val="right"/>
+            </w:pPr>
+            <w:r>
+              <w:rPr>
+                <w:rFonts w:ascii="Arial" w:cs="Arial" w:eastAsia="Arial" w:hAnsi="Arial"/>
+                <w:b w:val="false"/>
+                <w:bCs w:val="false"/>
+                <w:sz w:val="19"/>
+                <w:szCs w:val="19"/>
+              </w:rPr>
+              <w:t xml:space="preserve">_______________________ / ____/____/______</w:t>
+            </w:r>
+          </w:p>
+        </w:tc>
+      </w:tr>
+    </w:tbl>
+    <w:p>
+      <w:pPr>
+        <w:spacing w:after="240"/>
+      </w:pPr>
+    </w:p>
+    <w:p>
+      <w:pPr>
+        <w:shd w:fill="1F4E79" w:val="clear"/>
+        <w:bidi/>
+        <w:spacing w:after="100" w:before="220"/>
+        <w:jc w:val="right"/>
+      </w:pPr>
+      <w:r>
+        <w:rPr>
+          <w:rFonts w:ascii="Arial" w:cs="Arial" w:eastAsia="Arial" w:hAnsi="Arial"/>
+          <w:b/>
+          <w:bCs/>
+          <w:color w:val="FFFFFF"/>
+          <w:sz w:val="23"/>
+          <w:szCs w:val="23"/>
+        </w:rPr>
+        <w:t xml:space="preserve">UAT-23 — יצירת משתמש עם שיוך תפקידים ומחלקות עצמאי (מסלול חיובי)</w:t>
+      </w:r>
+    </w:p>
+    <w:tbl>
+      <w:tblPr>
+        <w:tblW w:type="dxa" w:w="8800"/>
+        <w:tblBorders>
+          <w:top w:val="single" w:color="auto" w:sz="4"/>
+          <w:left w:val="single" w:color="auto" w:sz="4"/>
+          <w:bottom w:val="single" w:color="auto" w:sz="4"/>
+          <w:right w:val="single" w:color="auto" w:sz="4"/>
+          <w:insideH w:val="single" w:color="auto" w:sz="4"/>
+          <w:insideV w:val="single" w:color="auto" w:sz="4"/>
+        </w:tblBorders>
+      </w:tblPr>
+      <w:tblGrid>
+        <w:gridCol w:w="2400"/>
+        <w:gridCol w:w="6400"/>
+      </w:tblGrid>
+      <w:tr>
+        <w:tc>
+          <w:tcPr>
+            <w:tcW w:type="dxa" w:w="2400"/>
+            <w:shd w:fill="2E75B6" w:val="clear"/>
+            <w:tcMar>
+              <w:top w:type="dxa" w:w="60"/>
+              <w:left w:type="dxa" w:w="90"/>
+              <w:bottom w:type="dxa" w:w="60"/>
+              <w:right w:type="dxa" w:w="90"/>
+            </w:tcMar>
+            <w:vAlign w:val="center"/>
+          </w:tcPr>
+          <w:p>
+            <w:pPr>
+              <w:bidi/>
+              <w:spacing w:after="0"/>
+              <w:jc w:val="right"/>
+            </w:pPr>
+            <w:r>
+              <w:rPr>
+                <w:rFonts w:ascii="Arial" w:cs="Arial" w:eastAsia="Arial" w:hAnsi="Arial"/>
+                <w:b/>
+                <w:bCs/>
+                <w:color w:val="FFFFFF"/>
+                <w:sz w:val="19"/>
+                <w:szCs w:val="19"/>
+              </w:rPr>
+              <w:t xml:space="preserve">שדה</w:t>
+            </w:r>
+          </w:p>
+        </w:tc>
+        <w:tc>
+          <w:tcPr>
+            <w:tcW w:type="dxa" w:w="6400"/>
+            <w:shd w:fill="2E75B6" w:val="clear"/>
+            <w:tcMar>
+              <w:top w:type="dxa" w:w="60"/>
+              <w:left w:type="dxa" w:w="90"/>
+              <w:bottom w:type="dxa" w:w="60"/>
+              <w:right w:type="dxa" w:w="90"/>
+            </w:tcMar>
+            <w:vAlign w:val="center"/>
+          </w:tcPr>
+          <w:p>
+            <w:pPr>
+              <w:bidi/>
+              <w:spacing w:after="0"/>
+              <w:jc w:val="right"/>
+            </w:pPr>
+            <w:r>
+              <w:rPr>
+                <w:rFonts w:ascii="Arial" w:cs="Arial" w:eastAsia="Arial" w:hAnsi="Arial"/>
+                <w:b/>
+                <w:bCs/>
+                <w:color w:val="FFFFFF"/>
+                <w:sz w:val="19"/>
+                <w:szCs w:val="19"/>
+              </w:rPr>
+              <w:t xml:space="preserve">ערך</w:t>
+            </w:r>
+          </w:p>
+        </w:tc>
+      </w:tr>
+      <w:tr>
+        <w:tc>
+          <w:tcPr>
+            <w:tcW w:type="dxa" w:w="2400"/>
+            <w:shd w:fill="EEF3F8" w:val="clear"/>
+            <w:tcMar>
+              <w:top w:type="dxa" w:w="60"/>
+              <w:left w:type="dxa" w:w="90"/>
+              <w:bottom w:type="dxa" w:w="60"/>
+              <w:right w:type="dxa" w:w="90"/>
+            </w:tcMar>
+            <w:vAlign w:val="center"/>
+          </w:tcPr>
+          <w:p>
+            <w:pPr>
+              <w:bidi/>
+              <w:spacing w:after="0"/>
+              <w:jc w:val="right"/>
+            </w:pPr>
+            <w:r>
+              <w:rPr>
+                <w:rFonts w:ascii="Arial" w:cs="Arial" w:eastAsia="Arial" w:hAnsi="Arial"/>
+                <w:b/>
+                <w:bCs/>
+                <w:sz w:val="19"/>
+                <w:szCs w:val="19"/>
+              </w:rPr>
+              <w:t xml:space="preserve">מודול / מקור</w:t>
+            </w:r>
+          </w:p>
+        </w:tc>
+        <w:tc>
+          <w:tcPr>
+            <w:tcW w:type="dxa" w:w="6400"/>
+            <w:tcMar>
+              <w:top w:type="dxa" w:w="60"/>
+              <w:left w:type="dxa" w:w="90"/>
+              <w:bottom w:type="dxa" w:w="60"/>
+              <w:right w:type="dxa" w:w="90"/>
+            </w:tcMar>
+            <w:vAlign w:val="center"/>
+          </w:tcPr>
+          <w:p>
+            <w:pPr>
+              <w:bidi/>
+              <w:spacing w:after="0"/>
+              <w:jc w:val="right"/>
+            </w:pPr>
+            <w:r>
+              <w:rPr>
+                <w:rFonts w:ascii="Arial" w:cs="Arial" w:eastAsia="Arial" w:hAnsi="Arial"/>
+                <w:b w:val="false"/>
+                <w:bCs w:val="false"/>
+                <w:sz w:val="19"/>
+                <w:szCs w:val="19"/>
+              </w:rPr>
+              <w:t xml:space="preserve">משתמשים והרשאות — פרק 25 באפיון; FR-177 עד FR-181; API Specification חלק ג׳, פרק 4.4</w:t>
+            </w:r>
+          </w:p>
+        </w:tc>
+      </w:tr>
+      <w:tr>
+        <w:tc>
+          <w:tcPr>
+            <w:tcW w:type="dxa" w:w="2400"/>
+            <w:shd w:fill="EEF3F8" w:val="clear"/>
+            <w:tcMar>
+              <w:top w:type="dxa" w:w="60"/>
+              <w:left w:type="dxa" w:w="90"/>
+              <w:bottom w:type="dxa" w:w="60"/>
+              <w:right w:type="dxa" w:w="90"/>
+            </w:tcMar>
+            <w:vAlign w:val="center"/>
+          </w:tcPr>
+          <w:p>
+            <w:pPr>
+              <w:bidi/>
+              <w:spacing w:after="0"/>
+              <w:jc w:val="right"/>
+            </w:pPr>
+            <w:r>
+              <w:rPr>
+                <w:rFonts w:ascii="Arial" w:cs="Arial" w:eastAsia="Arial" w:hAnsi="Arial"/>
+                <w:b/>
+                <w:bCs/>
+                <w:sz w:val="19"/>
+                <w:szCs w:val="19"/>
+              </w:rPr>
+              <w:t xml:space="preserve">תפקיד מבצע</w:t>
+            </w:r>
+          </w:p>
+        </w:tc>
+        <w:tc>
+          <w:tcPr>
+            <w:tcW w:type="dxa" w:w="6400"/>
+            <w:shd w:fill="F7FAFC" w:val="clear"/>
+            <w:tcMar>
+              <w:top w:type="dxa" w:w="60"/>
+              <w:left w:type="dxa" w:w="90"/>
+              <w:bottom w:type="dxa" w:w="60"/>
+              <w:right w:type="dxa" w:w="90"/>
+            </w:tcMar>
+            <w:vAlign w:val="center"/>
+          </w:tcPr>
+          <w:p>
+            <w:pPr>
+              <w:bidi/>
+              <w:spacing w:after="0"/>
+              <w:jc w:val="right"/>
+            </w:pPr>
+            <w:r>
+              <w:rPr>
+                <w:rFonts w:ascii="Arial" w:cs="Arial" w:eastAsia="Arial" w:hAnsi="Arial"/>
+                <w:b w:val="false"/>
+                <w:bCs w:val="false"/>
+                <w:sz w:val="19"/>
+                <w:szCs w:val="19"/>
+              </w:rPr>
+              <w:t xml:space="preserve">מנהל מערכת</w:t>
+            </w:r>
+          </w:p>
+        </w:tc>
+      </w:tr>
+      <w:tr>
+        <w:tc>
+          <w:tcPr>
+            <w:tcW w:type="dxa" w:w="2400"/>
+            <w:shd w:fill="EEF3F8" w:val="clear"/>
+            <w:tcMar>
+              <w:top w:type="dxa" w:w="60"/>
+              <w:left w:type="dxa" w:w="90"/>
+              <w:bottom w:type="dxa" w:w="60"/>
+              <w:right w:type="dxa" w:w="90"/>
+            </w:tcMar>
+            <w:vAlign w:val="center"/>
+          </w:tcPr>
+          <w:p>
+            <w:pPr>
+              <w:bidi/>
+              <w:spacing w:after="0"/>
+              <w:jc w:val="right"/>
+            </w:pPr>
+            <w:r>
+              <w:rPr>
+                <w:rFonts w:ascii="Arial" w:cs="Arial" w:eastAsia="Arial" w:hAnsi="Arial"/>
+                <w:b/>
+                <w:bCs/>
+                <w:sz w:val="19"/>
+                <w:szCs w:val="19"/>
+              </w:rPr>
+              <w:t xml:space="preserve">תנאי מוקדם / נתוני בדיקה</w:t>
+            </w:r>
+          </w:p>
+        </w:tc>
+        <w:tc>
+          <w:tcPr>
+            <w:tcW w:type="dxa" w:w="6400"/>
+            <w:tcMar>
+              <w:top w:type="dxa" w:w="60"/>
+              <w:left w:type="dxa" w:w="90"/>
+              <w:bottom w:type="dxa" w:w="60"/>
+              <w:right w:type="dxa" w:w="90"/>
+            </w:tcMar>
+            <w:vAlign w:val="center"/>
+          </w:tcPr>
+          <w:p>
+            <w:pPr>
+              <w:bidi/>
+              <w:spacing w:after="0"/>
+              <w:jc w:val="right"/>
+            </w:pPr>
+            <w:r>
+              <w:rPr>
+                <w:rFonts w:ascii="Arial" w:cs="Arial" w:eastAsia="Arial" w:hAnsi="Arial"/>
+                <w:b w:val="false"/>
+                <w:bCs w:val="false"/>
+                <w:sz w:val="19"/>
+                <w:szCs w:val="19"/>
+              </w:rPr>
+              <w:t xml:space="preserve">אתר קיים (site_id=1); רשימת 12 התפקידים ו-11 המחלקות טעונות מהמערכת</w:t>
+            </w:r>
+          </w:p>
+        </w:tc>
+      </w:tr>
+    </w:tbl>
+    <w:p>
+      <w:pPr>
+        <w:spacing w:after="80"/>
+      </w:pPr>
+    </w:p>
+    <w:p>
+      <w:pPr>
+        <w:bidi/>
+        <w:spacing w:after="40"/>
+        <w:jc w:val="right"/>
+      </w:pPr>
+      <w:r>
+        <w:rPr>
+          <w:rFonts w:ascii="Arial" w:cs="Arial" w:eastAsia="Arial" w:hAnsi="Arial"/>
+          <w:b/>
+          <w:bCs/>
+          <w:color w:val="1F4E79"/>
+          <w:sz w:val="20"/>
+          <w:szCs w:val="20"/>
+        </w:rPr>
+        <w:t xml:space="preserve">שלבי ביצוע:</w:t>
+      </w:r>
+    </w:p>
+    <w:p>
+      <w:pPr>
+        <w:bidi/>
+        <w:spacing w:after="60"/>
+        <w:ind w:right="420" w:hanging="260"/>
+        <w:jc w:val="right"/>
+      </w:pPr>
+      <w:r>
+        <w:rPr>
+          <w:rFonts w:ascii="Arial" w:cs="Arial" w:eastAsia="Arial" w:hAnsi="Arial"/>
+          <w:sz w:val="21"/>
+          <w:szCs w:val="21"/>
+        </w:rPr>
+        <w:t xml:space="preserve">1. מנהל מערכת פותח את מסך יצירת משתמש חדש, ממלא username/password/fullName/siteId, ואינו מסמן אף תפקיד.</w:t>
+      </w:r>
+    </w:p>
+    <w:p>
+      <w:pPr>
+        <w:bidi/>
+        <w:spacing w:after="60"/>
+        <w:ind w:right="420" w:hanging="260"/>
+        <w:jc w:val="right"/>
+      </w:pPr>
+      <w:r>
+        <w:rPr>
+          <w:rFonts w:ascii="Arial" w:cs="Arial" w:eastAsia="Arial" w:hAnsi="Arial"/>
+          <w:sz w:val="21"/>
+          <w:szCs w:val="21"/>
+        </w:rPr>
+        <w:t xml:space="preserve">2. ניסיון שמירה ללא תפקיד כלשהו.</w:t>
+      </w:r>
+    </w:p>
+    <w:p>
+      <w:pPr>
+        <w:bidi/>
+        <w:spacing w:after="60"/>
+        <w:ind w:right="420" w:hanging="260"/>
+        <w:jc w:val="right"/>
+      </w:pPr>
+      <w:r>
+        <w:rPr>
+          <w:rFonts w:ascii="Arial" w:cs="Arial" w:eastAsia="Arial" w:hAnsi="Arial"/>
+          <w:sz w:val="21"/>
+          <w:szCs w:val="21"/>
+        </w:rPr>
+        <w:t xml:space="preserve">3. סימון תפקיד אחד ("מנהל מטבח") ושתי מחלקות ("מטבח קר", "מטבח חלבי") — שני שדות בחירה נפרדים ובלתי-תלויים.</w:t>
+      </w:r>
+    </w:p>
+    <w:p>
+      <w:pPr>
+        <w:bidi/>
+        <w:spacing w:after="60"/>
+        <w:ind w:right="420" w:hanging="260"/>
+        <w:jc w:val="right"/>
+      </w:pPr>
+      <w:r>
+        <w:rPr>
+          <w:rFonts w:ascii="Arial" w:cs="Arial" w:eastAsia="Arial" w:hAnsi="Arial"/>
+          <w:sz w:val="21"/>
+          <w:szCs w:val="21"/>
+        </w:rPr>
+        <w:t xml:space="preserve">4. שמירה.</w:t>
+      </w:r>
+    </w:p>
+    <w:p>
+      <w:pPr>
+        <w:bidi/>
+        <w:spacing w:after="60"/>
+        <w:ind w:right="420" w:hanging="260"/>
+        <w:jc w:val="right"/>
+      </w:pPr>
+      <w:r>
+        <w:rPr>
+          <w:rFonts w:ascii="Arial" w:cs="Arial" w:eastAsia="Arial" w:hAnsi="Arial"/>
+          <w:sz w:val="21"/>
+          <w:szCs w:val="21"/>
+        </w:rPr>
+        <w:t xml:space="preserve">5. פתיחת אותו משתמש לעריכה, הסרת שתי המחלקות (השארת המערך ריק), ושמירה מחדש.</w:t>
+      </w:r>
+    </w:p>
+    <w:p>
+      <w:pPr>
+        <w:bidi/>
+        <w:spacing w:after="40" w:before="80"/>
+        <w:jc w:val="right"/>
+      </w:pPr>
+      <w:r>
+        <w:rPr>
+          <w:rFonts w:ascii="Arial" w:cs="Arial" w:eastAsia="Arial" w:hAnsi="Arial"/>
+          <w:b/>
+          <w:bCs/>
+          <w:color w:val="1F4E79"/>
+          <w:sz w:val="20"/>
+          <w:szCs w:val="20"/>
+        </w:rPr>
+        <w:t xml:space="preserve">תוצאה צפויה:</w:t>
+      </w:r>
+    </w:p>
+    <w:p>
+      <w:pPr>
+        <w:bidi/>
+        <w:spacing w:after="140" w:line="300"/>
+        <w:jc w:val="right"/>
+      </w:pPr>
+      <w:r>
+        <w:rPr>
+          <w:rFonts w:ascii="Arial" w:cs="Arial" w:eastAsia="Arial" w:hAnsi="Arial"/>
+          <w:b w:val="false"/>
+          <w:bCs w:val="false"/>
+          <w:i w:val="false"/>
+          <w:iCs w:val="false"/>
+          <w:sz w:val="22"/>
+          <w:szCs w:val="22"/>
+        </w:rPr>
+        <w:t xml:space="preserve">שלב 2: השמירה נחסמת (422, field_errors על role_ids) — אין אפשרות ליצור משתמש ללא תפקיד. שלב 4: המשתמש נוצר (201) עם role_ids=[מנהל מטבח] ו-department_ids=[מטבח קר, מטבח חלבי], ומופיע ברשימה עם שני התגיות (תפקידים ומחלקות) מוצגות בנפרד. שלב 5: העדכון מצליח (200) עם department_ids=[] — ריקון שיוך המחלקות אינו חוסם שמירה, בניגוד לריקון role_ids.</w:t>
+      </w:r>
+    </w:p>
+    <w:p>
+      <w:pPr>
+        <w:bidi/>
+        <w:spacing w:after="40" w:before="40"/>
+        <w:jc w:val="right"/>
+      </w:pPr>
+      <w:r>
+        <w:rPr>
+          <w:rFonts w:ascii="Arial" w:cs="Arial" w:eastAsia="Arial" w:hAnsi="Arial"/>
+          <w:b/>
+          <w:bCs/>
+          <w:color w:val="1F4E79"/>
+          <w:sz w:val="20"/>
+          <w:szCs w:val="20"/>
+        </w:rPr>
+        <w:t xml:space="preserve">קריטריון קבלה (Pass/Fail):</w:t>
+      </w:r>
+    </w:p>
+    <w:p>
+      <w:pPr>
+        <w:bidi/>
+        <w:spacing w:after="140" w:line="300"/>
+        <w:jc w:val="right"/>
+      </w:pPr>
+      <w:r>
+        <w:rPr>
+          <w:rFonts w:ascii="Arial" w:cs="Arial" w:eastAsia="Arial" w:hAnsi="Arial"/>
+          <w:b w:val="false"/>
+          <w:bCs w:val="false"/>
+          <w:i w:val="false"/>
+          <w:iCs w:val="false"/>
+          <w:sz w:val="22"/>
+          <w:szCs w:val="22"/>
+        </w:rPr>
+        <w:t xml:space="preserve">Pass אך ורק אם: (א) יצירה ללא תפקיד נחסמת; (ב) יצירה עם תפקיד ומחלקות מצליחה ושני השדות נשמרים כרשימות עצמאיות (לא שדה משולב אחד); (ג) עדכון לריקון department_ids בלבד (ללא נגיעה ב-role_ids) מצליח ללא שגיאה. כשל בכל אחד מהתנאים = Fail.</w:t>
+      </w:r>
+    </w:p>
+    <w:tbl>
+      <w:tblPr>
+        <w:tblW w:type="dxa" w:w="8800"/>
+        <w:tblBorders>
+          <w:top w:val="single" w:color="auto" w:sz="4"/>
+          <w:left w:val="single" w:color="auto" w:sz="4"/>
+          <w:bottom w:val="single" w:color="auto" w:sz="4"/>
+          <w:right w:val="single" w:color="auto" w:sz="4"/>
+          <w:insideH w:val="single" w:color="auto" w:sz="4"/>
+          <w:insideV w:val="single" w:color="auto" w:sz="4"/>
+        </w:tblBorders>
+      </w:tblPr>
+      <w:tblGrid>
+        <w:gridCol w:w="2200"/>
+        <w:gridCol w:w="6600"/>
+      </w:tblGrid>
+      <w:tr>
+        <w:tc>
+          <w:tcPr>
+            <w:tcW w:type="dxa" w:w="2200"/>
+            <w:shd w:fill="555555" w:val="clear"/>
+            <w:tcMar>
+              <w:top w:type="dxa" w:w="60"/>
+              <w:left w:type="dxa" w:w="90"/>
+              <w:bottom w:type="dxa" w:w="60"/>
+              <w:right w:type="dxa" w:w="90"/>
+            </w:tcMar>
+            <w:vAlign w:val="center"/>
+          </w:tcPr>
+          <w:p>
+            <w:pPr>
+              <w:bidi/>
+              <w:spacing w:after="0"/>
+              <w:jc w:val="right"/>
+            </w:pPr>
+            <w:r>
+              <w:rPr>
+                <w:rFonts w:ascii="Arial" w:cs="Arial" w:eastAsia="Arial" w:hAnsi="Arial"/>
+                <w:b/>
+                <w:bCs/>
+                <w:color w:val="FFFFFF"/>
+                <w:sz w:val="19"/>
+                <w:szCs w:val="19"/>
+              </w:rPr>
+              <w:t xml:space="preserve">תוצאה בפועל</w:t>
+            </w:r>
+          </w:p>
+        </w:tc>
+        <w:tc>
+          <w:tcPr>
+            <w:tcW w:type="dxa" w:w="6600"/>
+            <w:tcMar>
+              <w:top w:type="dxa" w:w="60"/>
+              <w:left w:type="dxa" w:w="90"/>
+              <w:bottom w:type="dxa" w:w="60"/>
+              <w:right w:type="dxa" w:w="90"/>
+            </w:tcMar>
+            <w:vAlign w:val="center"/>
+          </w:tcPr>
+          <w:p>
+            <w:pPr>
+              <w:bidi/>
+              <w:spacing w:after="0"/>
+              <w:jc w:val="right"/>
+            </w:pPr>
+            <w:r>
+              <w:rPr>
+                <w:rFonts w:ascii="Arial" w:cs="Arial" w:eastAsia="Arial" w:hAnsi="Arial"/>
+                <w:b w:val="false"/>
+                <w:bCs w:val="false"/>
+                <w:sz w:val="19"/>
+                <w:szCs w:val="19"/>
+              </w:rPr>
+              <w:t xml:space="preserve">☐ Pass   ☐ Fail   |   הערות: ___________________________</w:t>
+            </w:r>
+          </w:p>
+        </w:tc>
+      </w:tr>
+      <w:tr>
+        <w:tc>
+          <w:tcPr>
+            <w:tcW w:type="dxa" w:w="2200"/>
+            <w:shd w:fill="555555" w:val="clear"/>
+            <w:tcMar>
+              <w:top w:type="dxa" w:w="60"/>
+              <w:left w:type="dxa" w:w="90"/>
+              <w:bottom w:type="dxa" w:w="60"/>
+              <w:right w:type="dxa" w:w="90"/>
+            </w:tcMar>
+            <w:vAlign w:val="center"/>
+          </w:tcPr>
+          <w:p>
+            <w:pPr>
+              <w:bidi/>
+              <w:spacing w:after="0"/>
+              <w:jc w:val="right"/>
+            </w:pPr>
+            <w:r>
+              <w:rPr>
+                <w:rFonts w:ascii="Arial" w:cs="Arial" w:eastAsia="Arial" w:hAnsi="Arial"/>
+                <w:b/>
+                <w:bCs/>
+                <w:color w:val="FFFFFF"/>
+                <w:sz w:val="19"/>
+                <w:szCs w:val="19"/>
+              </w:rPr>
+              <w:t xml:space="preserve">נבדק ע"י / תאריך</w:t>
+            </w:r>
+          </w:p>
+        </w:tc>
+        <w:tc>
+          <w:tcPr>
+            <w:tcW w:type="dxa" w:w="6600"/>
+            <w:tcMar>
+              <w:top w:type="dxa" w:w="60"/>
+              <w:left w:type="dxa" w:w="90"/>
+              <w:bottom w:type="dxa" w:w="60"/>
+              <w:right w:type="dxa" w:w="90"/>
+            </w:tcMar>
+            <w:vAlign w:val="center"/>
+          </w:tcPr>
+          <w:p>
+            <w:pPr>
+              <w:bidi/>
+              <w:spacing w:after="0"/>
+              <w:jc w:val="right"/>
+            </w:pPr>
+            <w:r>
+              <w:rPr>
+                <w:rFonts w:ascii="Arial" w:cs="Arial" w:eastAsia="Arial" w:hAnsi="Arial"/>
+                <w:b w:val="false"/>
+                <w:bCs w:val="false"/>
+                <w:sz w:val="19"/>
+                <w:szCs w:val="19"/>
+              </w:rPr>
+              <w:t xml:space="preserve">_______________________ / ____/____/______</w:t>
+            </w:r>
+          </w:p>
+        </w:tc>
+      </w:tr>
+    </w:tbl>
+    <w:p>
+      <w:pPr>
+        <w:spacing w:after="240"/>
+      </w:pPr>
+    </w:p>
+    <w:p>
+      <w:pPr>
+        <w:shd w:fill="1F4E79" w:val="clear"/>
+        <w:bidi/>
+        <w:spacing w:after="100" w:before="220"/>
+        <w:jc w:val="right"/>
+      </w:pPr>
+      <w:r>
+        <w:rPr>
+          <w:rFonts w:ascii="Arial" w:cs="Arial" w:eastAsia="Arial" w:hAnsi="Arial"/>
+          <w:b/>
+          <w:bCs/>
+          <w:color w:val="FFFFFF"/>
+          <w:sz w:val="23"/>
+          <w:szCs w:val="23"/>
+        </w:rPr>
+        <w:t xml:space="preserve">UAT-24 — השבתה/הפעלה מחדש של משתמש, כולל חסימת התחברות</w:t>
+      </w:r>
+    </w:p>
+    <w:tbl>
+      <w:tblPr>
+        <w:tblW w:type="dxa" w:w="8800"/>
+        <w:tblBorders>
+          <w:top w:val="single" w:color="auto" w:sz="4"/>
+          <w:left w:val="single" w:color="auto" w:sz="4"/>
+          <w:bottom w:val="single" w:color="auto" w:sz="4"/>
+          <w:right w:val="single" w:color="auto" w:sz="4"/>
+          <w:insideH w:val="single" w:color="auto" w:sz="4"/>
+          <w:insideV w:val="single" w:color="auto" w:sz="4"/>
+        </w:tblBorders>
+      </w:tblPr>
+      <w:tblGrid>
+        <w:gridCol w:w="2400"/>
+        <w:gridCol w:w="6400"/>
+      </w:tblGrid>
+      <w:tr>
+        <w:tc>
+          <w:tcPr>
+            <w:tcW w:type="dxa" w:w="2400"/>
+            <w:shd w:fill="2E75B6" w:val="clear"/>
+            <w:tcMar>
+              <w:top w:type="dxa" w:w="60"/>
+              <w:left w:type="dxa" w:w="90"/>
+              <w:bottom w:type="dxa" w:w="60"/>
+              <w:right w:type="dxa" w:w="90"/>
+            </w:tcMar>
+            <w:vAlign w:val="center"/>
+          </w:tcPr>
+          <w:p>
+            <w:pPr>
+              <w:bidi/>
+              <w:spacing w:after="0"/>
+              <w:jc w:val="right"/>
+            </w:pPr>
+            <w:r>
+              <w:rPr>
+                <w:rFonts w:ascii="Arial" w:cs="Arial" w:eastAsia="Arial" w:hAnsi="Arial"/>
+                <w:b/>
+                <w:bCs/>
+                <w:color w:val="FFFFFF"/>
+                <w:sz w:val="19"/>
+                <w:szCs w:val="19"/>
+              </w:rPr>
+              <w:t xml:space="preserve">שדה</w:t>
+            </w:r>
+          </w:p>
+        </w:tc>
+        <w:tc>
+          <w:tcPr>
+            <w:tcW w:type="dxa" w:w="6400"/>
+            <w:shd w:fill="2E75B6" w:val="clear"/>
+            <w:tcMar>
+              <w:top w:type="dxa" w:w="60"/>
+              <w:left w:type="dxa" w:w="90"/>
+              <w:bottom w:type="dxa" w:w="60"/>
+              <w:right w:type="dxa" w:w="90"/>
+            </w:tcMar>
+            <w:vAlign w:val="center"/>
+          </w:tcPr>
+          <w:p>
+            <w:pPr>
+              <w:bidi/>
+              <w:spacing w:after="0"/>
+              <w:jc w:val="right"/>
+            </w:pPr>
+            <w:r>
+              <w:rPr>
+                <w:rFonts w:ascii="Arial" w:cs="Arial" w:eastAsia="Arial" w:hAnsi="Arial"/>
+                <w:b/>
+                <w:bCs/>
+                <w:color w:val="FFFFFF"/>
+                <w:sz w:val="19"/>
+                <w:szCs w:val="19"/>
+              </w:rPr>
+              <w:t xml:space="preserve">ערך</w:t>
+            </w:r>
+          </w:p>
+        </w:tc>
+      </w:tr>
+      <w:tr>
+        <w:tc>
+          <w:tcPr>
+            <w:tcW w:type="dxa" w:w="2400"/>
+            <w:shd w:fill="EEF3F8" w:val="clear"/>
+            <w:tcMar>
+              <w:top w:type="dxa" w:w="60"/>
+              <w:left w:type="dxa" w:w="90"/>
+              <w:bottom w:type="dxa" w:w="60"/>
+              <w:right w:type="dxa" w:w="90"/>
+            </w:tcMar>
+            <w:vAlign w:val="center"/>
+          </w:tcPr>
+          <w:p>
+            <w:pPr>
+              <w:bidi/>
+              <w:spacing w:after="0"/>
+              <w:jc w:val="right"/>
+            </w:pPr>
+            <w:r>
+              <w:rPr>
+                <w:rFonts w:ascii="Arial" w:cs="Arial" w:eastAsia="Arial" w:hAnsi="Arial"/>
+                <w:b/>
+                <w:bCs/>
+                <w:sz w:val="19"/>
+                <w:szCs w:val="19"/>
+              </w:rPr>
+              <w:t xml:space="preserve">מודול / מקור</w:t>
+            </w:r>
+          </w:p>
+        </w:tc>
+        <w:tc>
+          <w:tcPr>
+            <w:tcW w:type="dxa" w:w="6400"/>
+            <w:tcMar>
+              <w:top w:type="dxa" w:w="60"/>
+              <w:left w:type="dxa" w:w="90"/>
+              <w:bottom w:type="dxa" w:w="60"/>
+              <w:right w:type="dxa" w:w="90"/>
+            </w:tcMar>
+            <w:vAlign w:val="center"/>
+          </w:tcPr>
+          <w:p>
+            <w:pPr>
+              <w:bidi/>
+              <w:spacing w:after="0"/>
+              <w:jc w:val="right"/>
+            </w:pPr>
+            <w:r>
+              <w:rPr>
+                <w:rFonts w:ascii="Arial" w:cs="Arial" w:eastAsia="Arial" w:hAnsi="Arial"/>
+                <w:b w:val="false"/>
+                <w:bCs w:val="false"/>
+                <w:sz w:val="19"/>
+                <w:szCs w:val="19"/>
+              </w:rPr>
+              <w:t xml:space="preserve">משתמשים והרשאות — פרק 25 באפיון; FR-180; API Specification חלק ג׳, פרק 4.4.4, 4.4.6</w:t>
+            </w:r>
+          </w:p>
+        </w:tc>
+      </w:tr>
+      <w:tr>
+        <w:tc>
+          <w:tcPr>
+            <w:tcW w:type="dxa" w:w="2400"/>
+            <w:shd w:fill="EEF3F8" w:val="clear"/>
+            <w:tcMar>
+              <w:top w:type="dxa" w:w="60"/>
+              <w:left w:type="dxa" w:w="90"/>
+              <w:bottom w:type="dxa" w:w="60"/>
+              <w:right w:type="dxa" w:w="90"/>
+            </w:tcMar>
+            <w:vAlign w:val="center"/>
+          </w:tcPr>
+          <w:p>
+            <w:pPr>
+              <w:bidi/>
+              <w:spacing w:after="0"/>
+              <w:jc w:val="right"/>
+            </w:pPr>
+            <w:r>
+              <w:rPr>
+                <w:rFonts w:ascii="Arial" w:cs="Arial" w:eastAsia="Arial" w:hAnsi="Arial"/>
+                <w:b/>
+                <w:bCs/>
+                <w:sz w:val="19"/>
+                <w:szCs w:val="19"/>
+              </w:rPr>
+              <w:t xml:space="preserve">תפקיד מבצע</w:t>
+            </w:r>
+          </w:p>
+        </w:tc>
+        <w:tc>
+          <w:tcPr>
+            <w:tcW w:type="dxa" w:w="6400"/>
+            <w:shd w:fill="F7FAFC" w:val="clear"/>
+            <w:tcMar>
+              <w:top w:type="dxa" w:w="60"/>
+              <w:left w:type="dxa" w:w="90"/>
+              <w:bottom w:type="dxa" w:w="60"/>
+              <w:right w:type="dxa" w:w="90"/>
+            </w:tcMar>
+            <w:vAlign w:val="center"/>
+          </w:tcPr>
+          <w:p>
+            <w:pPr>
+              <w:bidi/>
+              <w:spacing w:after="0"/>
+              <w:jc w:val="right"/>
+            </w:pPr>
+            <w:r>
+              <w:rPr>
+                <w:rFonts w:ascii="Arial" w:cs="Arial" w:eastAsia="Arial" w:hAnsi="Arial"/>
+                <w:b w:val="false"/>
+                <w:bCs w:val="false"/>
+                <w:sz w:val="19"/>
+                <w:szCs w:val="19"/>
+              </w:rPr>
+              <w:t xml:space="preserve">מנהל מערכת</w:t>
+            </w:r>
+          </w:p>
+        </w:tc>
+      </w:tr>
+      <w:tr>
+        <w:tc>
+          <w:tcPr>
+            <w:tcW w:type="dxa" w:w="2400"/>
+            <w:shd w:fill="EEF3F8" w:val="clear"/>
+            <w:tcMar>
+              <w:top w:type="dxa" w:w="60"/>
+              <w:left w:type="dxa" w:w="90"/>
+              <w:bottom w:type="dxa" w:w="60"/>
+              <w:right w:type="dxa" w:w="90"/>
+            </w:tcMar>
+            <w:vAlign w:val="center"/>
+          </w:tcPr>
+          <w:p>
+            <w:pPr>
+              <w:bidi/>
+              <w:spacing w:after="0"/>
+              <w:jc w:val="right"/>
+            </w:pPr>
+            <w:r>
+              <w:rPr>
+                <w:rFonts w:ascii="Arial" w:cs="Arial" w:eastAsia="Arial" w:hAnsi="Arial"/>
+                <w:b/>
+                <w:bCs/>
+                <w:sz w:val="19"/>
+                <w:szCs w:val="19"/>
+              </w:rPr>
+              <w:t xml:space="preserve">תנאי מוקדם / נתוני בדיקה</w:t>
+            </w:r>
+          </w:p>
+        </w:tc>
+        <w:tc>
+          <w:tcPr>
+            <w:tcW w:type="dxa" w:w="6400"/>
+            <w:tcMar>
+              <w:top w:type="dxa" w:w="60"/>
+              <w:left w:type="dxa" w:w="90"/>
+              <w:bottom w:type="dxa" w:w="60"/>
+              <w:right w:type="dxa" w:w="90"/>
+            </w:tcMar>
+            <w:vAlign w:val="center"/>
+          </w:tcPr>
+          <w:p>
+            <w:pPr>
+              <w:bidi/>
+              <w:spacing w:after="0"/>
+              <w:jc w:val="right"/>
+            </w:pPr>
+            <w:r>
+              <w:rPr>
+                <w:rFonts w:ascii="Arial" w:cs="Arial" w:eastAsia="Arial" w:hAnsi="Arial"/>
+                <w:b w:val="false"/>
+                <w:bCs w:val="false"/>
+                <w:sz w:val="19"/>
+                <w:szCs w:val="19"/>
+              </w:rPr>
+              <w:t xml:space="preserve">משתמש פעיל קיים (מ-UAT-23), עם username/password ידועים</w:t>
+            </w:r>
+          </w:p>
+        </w:tc>
+      </w:tr>
+    </w:tbl>
+    <w:p>
+      <w:pPr>
+        <w:spacing w:after="80"/>
+      </w:pPr>
+    </w:p>
+    <w:p>
+      <w:pPr>
+        <w:bidi/>
+        <w:spacing w:after="40"/>
+        <w:jc w:val="right"/>
+      </w:pPr>
+      <w:r>
+        <w:rPr>
+          <w:rFonts w:ascii="Arial" w:cs="Arial" w:eastAsia="Arial" w:hAnsi="Arial"/>
+          <w:b/>
+          <w:bCs/>
+          <w:color w:val="1F4E79"/>
+          <w:sz w:val="20"/>
+          <w:szCs w:val="20"/>
+        </w:rPr>
+        <w:t xml:space="preserve">שלבי ביצוע:</w:t>
+      </w:r>
+    </w:p>
+    <w:p>
+      <w:pPr>
+        <w:bidi/>
+        <w:spacing w:after="60"/>
+        <w:ind w:right="420" w:hanging="260"/>
+        <w:jc w:val="right"/>
+      </w:pPr>
+      <w:r>
+        <w:rPr>
+          <w:rFonts w:ascii="Arial" w:cs="Arial" w:eastAsia="Arial" w:hAnsi="Arial"/>
+          <w:sz w:val="21"/>
+          <w:szCs w:val="21"/>
+        </w:rPr>
+        <w:t xml:space="preserve">1. מנהל מערכת מבצע השבתה (Deactivate) למשתמש.</w:t>
+      </w:r>
+    </w:p>
+    <w:p>
+      <w:pPr>
+        <w:bidi/>
+        <w:spacing w:after="60"/>
+        <w:ind w:right="420" w:hanging="260"/>
+        <w:jc w:val="right"/>
+      </w:pPr>
+      <w:r>
+        <w:rPr>
+          <w:rFonts w:ascii="Arial" w:cs="Arial" w:eastAsia="Arial" w:hAnsi="Arial"/>
+          <w:sz w:val="21"/>
+          <w:szCs w:val="21"/>
+        </w:rPr>
+        <w:t xml:space="preserve">2. ניסיון התחברות בפועל עם אותו username/password דרך מסך הלוגין.</w:t>
+      </w:r>
+    </w:p>
+    <w:p>
+      <w:pPr>
+        <w:bidi/>
+        <w:spacing w:after="60"/>
+        <w:ind w:right="420" w:hanging="260"/>
+        <w:jc w:val="right"/>
+      </w:pPr>
+      <w:r>
+        <w:rPr>
+          <w:rFonts w:ascii="Arial" w:cs="Arial" w:eastAsia="Arial" w:hAnsi="Arial"/>
+          <w:sz w:val="21"/>
+          <w:szCs w:val="21"/>
+        </w:rPr>
+        <w:t xml:space="preserve">3. מנהל מערכת מבצע הפעלה מחדש (Activate) לאותו משתמש.</w:t>
+      </w:r>
+    </w:p>
+    <w:p>
+      <w:pPr>
+        <w:bidi/>
+        <w:spacing w:after="60"/>
+        <w:ind w:right="420" w:hanging="260"/>
+        <w:jc w:val="right"/>
+      </w:pPr>
+      <w:r>
+        <w:rPr>
+          <w:rFonts w:ascii="Arial" w:cs="Arial" w:eastAsia="Arial" w:hAnsi="Arial"/>
+          <w:sz w:val="21"/>
+          <w:szCs w:val="21"/>
+        </w:rPr>
+        <w:t xml:space="preserve">4. ניסיון התחברות חוזר עם אותם פרטים.</w:t>
+      </w:r>
+    </w:p>
+    <w:p>
+      <w:pPr>
+        <w:bidi/>
+        <w:spacing w:after="40" w:before="80"/>
+        <w:jc w:val="right"/>
+      </w:pPr>
+      <w:r>
+        <w:rPr>
+          <w:rFonts w:ascii="Arial" w:cs="Arial" w:eastAsia="Arial" w:hAnsi="Arial"/>
+          <w:b/>
+          <w:bCs/>
+          <w:color w:val="1F4E79"/>
+          <w:sz w:val="20"/>
+          <w:szCs w:val="20"/>
+        </w:rPr>
+        <w:t xml:space="preserve">תוצאה צפויה:</w:t>
+      </w:r>
+    </w:p>
+    <w:p>
+      <w:pPr>
+        <w:bidi/>
+        <w:spacing w:after="140" w:line="300"/>
+        <w:jc w:val="right"/>
+      </w:pPr>
+      <w:r>
+        <w:rPr>
+          <w:rFonts w:ascii="Arial" w:cs="Arial" w:eastAsia="Arial" w:hAnsi="Arial"/>
+          <w:b w:val="false"/>
+          <w:bCs w:val="false"/>
+          <w:i w:val="false"/>
+          <w:iCs w:val="false"/>
+          <w:sz w:val="22"/>
+          <w:szCs w:val="22"/>
+        </w:rPr>
+        <w:t xml:space="preserve">שלב 1: status עובר ל-inactive (200), המשתמש ממשיך להופיע ברשימה (לא נמחק). שלב 2: ההתחברות נדחית (401) עם הודעה זהה להודעת "שם משתמש/סיסמה שגויים" הרגילה — לא נחשפת עובדת ההשבתה. שלב 3: status חוזר ל-active (200). שלב 4: ההתחברות מצליחה (200) ומחזירה access_token תקין.</w:t>
+      </w:r>
+    </w:p>
+    <w:p>
+      <w:pPr>
+        <w:bidi/>
+        <w:spacing w:after="40" w:before="40"/>
+        <w:jc w:val="right"/>
+      </w:pPr>
+      <w:r>
+        <w:rPr>
+          <w:rFonts w:ascii="Arial" w:cs="Arial" w:eastAsia="Arial" w:hAnsi="Arial"/>
+          <w:b/>
+          <w:bCs/>
+          <w:color w:val="1F4E79"/>
+          <w:sz w:val="20"/>
+          <w:szCs w:val="20"/>
+        </w:rPr>
+        <w:t xml:space="preserve">קריטריון קבלה (Pass/Fail):</w:t>
+      </w:r>
+    </w:p>
+    <w:p>
+      <w:pPr>
+        <w:bidi/>
+        <w:spacing w:after="140" w:line="300"/>
+        <w:jc w:val="right"/>
+      </w:pPr>
+      <w:r>
+        <w:rPr>
+          <w:rFonts w:ascii="Arial" w:cs="Arial" w:eastAsia="Arial" w:hAnsi="Arial"/>
+          <w:b w:val="false"/>
+          <w:bCs w:val="false"/>
+          <w:i w:val="false"/>
+          <w:iCs w:val="false"/>
+          <w:sz w:val="22"/>
+          <w:szCs w:val="22"/>
+        </w:rPr>
+        <w:t xml:space="preserve">Pass אך ורק אם: (א) משתמש מושבת אינו נמחק, רק מסומן inactive; (ב) ניסיון התחברות של משתמש מושבת נכשל (401) בהודעה שאינה מבחינה בין "לא קיים" ל"מושבת"; (ג) לאחר הפעלה מחדש ההתחברות חוזרת לעבוד באותם פרטים בדיוק, ללא צורך באיפוס סיסמה.</w:t>
       </w:r>
     </w:p>
     <w:tbl>
@@ -15872,6 +17070,246 @@
                 <w:szCs w:val="19"/>
               </w:rPr>
               <w:t xml:space="preserve">FR-096 עד FR-106</w:t>
+            </w:r>
+          </w:p>
+        </w:tc>
+      </w:tr>
+      <w:tr>
+        <w:tc>
+          <w:tcPr>
+            <w:tcW w:type="dxa" w:w="1400"/>
+            <w:tcMar>
+              <w:top w:type="dxa" w:w="60"/>
+              <w:left w:type="dxa" w:w="90"/>
+              <w:bottom w:type="dxa" w:w="60"/>
+              <w:right w:type="dxa" w:w="90"/>
+            </w:tcMar>
+            <w:vAlign w:val="center"/>
+          </w:tcPr>
+          <w:p>
+            <w:pPr>
+              <w:bidi/>
+              <w:spacing w:after="0"/>
+              <w:jc w:val="right"/>
+            </w:pPr>
+            <w:r>
+              <w:rPr>
+                <w:rFonts w:ascii="Arial" w:cs="Arial" w:eastAsia="Arial" w:hAnsi="Arial"/>
+                <w:b w:val="false"/>
+                <w:bCs w:val="false"/>
+                <w:sz w:val="19"/>
+                <w:szCs w:val="19"/>
+              </w:rPr>
+              <w:t xml:space="preserve">UAT-23</w:t>
+            </w:r>
+          </w:p>
+        </w:tc>
+        <w:tc>
+          <w:tcPr>
+            <w:tcW w:type="dxa" w:w="3200"/>
+            <w:tcMar>
+              <w:top w:type="dxa" w:w="60"/>
+              <w:left w:type="dxa" w:w="90"/>
+              <w:bottom w:type="dxa" w:w="60"/>
+              <w:right w:type="dxa" w:w="90"/>
+            </w:tcMar>
+            <w:vAlign w:val="center"/>
+          </w:tcPr>
+          <w:p>
+            <w:pPr>
+              <w:bidi/>
+              <w:spacing w:after="0"/>
+              <w:jc w:val="right"/>
+            </w:pPr>
+            <w:r>
+              <w:rPr>
+                <w:rFonts w:ascii="Arial" w:cs="Arial" w:eastAsia="Arial" w:hAnsi="Arial"/>
+                <w:b w:val="false"/>
+                <w:bCs w:val="false"/>
+                <w:sz w:val="19"/>
+                <w:szCs w:val="19"/>
+              </w:rPr>
+              <w:t xml:space="preserve">יצירת משתמש — Role+Department עצמאיים</w:t>
+            </w:r>
+          </w:p>
+        </w:tc>
+        <w:tc>
+          <w:tcPr>
+            <w:tcW w:type="dxa" w:w="3200"/>
+            <w:tcMar>
+              <w:top w:type="dxa" w:w="60"/>
+              <w:left w:type="dxa" w:w="90"/>
+              <w:bottom w:type="dxa" w:w="60"/>
+              <w:right w:type="dxa" w:w="90"/>
+            </w:tcMar>
+            <w:vAlign w:val="center"/>
+          </w:tcPr>
+          <w:p>
+            <w:pPr>
+              <w:bidi/>
+              <w:spacing w:after="0"/>
+              <w:jc w:val="right"/>
+            </w:pPr>
+            <w:r>
+              <w:rPr>
+                <w:rFonts w:ascii="Arial" w:cs="Arial" w:eastAsia="Arial" w:hAnsi="Arial"/>
+                <w:b w:val="false"/>
+                <w:bCs w:val="false"/>
+                <w:sz w:val="19"/>
+                <w:szCs w:val="19"/>
+              </w:rPr>
+              <w:t xml:space="preserve">אפיון עסקי 25.1-25.2; API חלק ג׳ 4.4</w:t>
+            </w:r>
+          </w:p>
+        </w:tc>
+        <w:tc>
+          <w:tcPr>
+            <w:tcW w:type="dxa" w:w="1900"/>
+            <w:tcMar>
+              <w:top w:type="dxa" w:w="60"/>
+              <w:left w:type="dxa" w:w="90"/>
+              <w:bottom w:type="dxa" w:w="60"/>
+              <w:right w:type="dxa" w:w="90"/>
+            </w:tcMar>
+            <w:vAlign w:val="center"/>
+          </w:tcPr>
+          <w:p>
+            <w:pPr>
+              <w:bidi/>
+              <w:spacing w:after="0"/>
+              <w:jc w:val="right"/>
+            </w:pPr>
+            <w:r>
+              <w:rPr>
+                <w:rFonts w:ascii="Arial" w:cs="Arial" w:eastAsia="Arial" w:hAnsi="Arial"/>
+                <w:b w:val="false"/>
+                <w:bCs w:val="false"/>
+                <w:sz w:val="19"/>
+                <w:szCs w:val="19"/>
+              </w:rPr>
+              <w:t xml:space="preserve">FR-177 עד FR-181</w:t>
+            </w:r>
+          </w:p>
+        </w:tc>
+      </w:tr>
+      <w:tr>
+        <w:tc>
+          <w:tcPr>
+            <w:tcW w:type="dxa" w:w="1400"/>
+            <w:shd w:fill="F2F6FA" w:val="clear"/>
+            <w:tcMar>
+              <w:top w:type="dxa" w:w="60"/>
+              <w:left w:type="dxa" w:w="90"/>
+              <w:bottom w:type="dxa" w:w="60"/>
+              <w:right w:type="dxa" w:w="90"/>
+            </w:tcMar>
+            <w:vAlign w:val="center"/>
+          </w:tcPr>
+          <w:p>
+            <w:pPr>
+              <w:bidi/>
+              <w:spacing w:after="0"/>
+              <w:jc w:val="right"/>
+            </w:pPr>
+            <w:r>
+              <w:rPr>
+                <w:rFonts w:ascii="Arial" w:cs="Arial" w:eastAsia="Arial" w:hAnsi="Arial"/>
+                <w:b w:val="false"/>
+                <w:bCs w:val="false"/>
+                <w:sz w:val="19"/>
+                <w:szCs w:val="19"/>
+              </w:rPr>
+              <w:t xml:space="preserve">UAT-24</w:t>
+            </w:r>
+          </w:p>
+        </w:tc>
+        <w:tc>
+          <w:tcPr>
+            <w:tcW w:type="dxa" w:w="3200"/>
+            <w:shd w:fill="F2F6FA" w:val="clear"/>
+            <w:tcMar>
+              <w:top w:type="dxa" w:w="60"/>
+              <w:left w:type="dxa" w:w="90"/>
+              <w:bottom w:type="dxa" w:w="60"/>
+              <w:right w:type="dxa" w:w="90"/>
+            </w:tcMar>
+            <w:vAlign w:val="center"/>
+          </w:tcPr>
+          <w:p>
+            <w:pPr>
+              <w:bidi/>
+              <w:spacing w:after="0"/>
+              <w:jc w:val="right"/>
+            </w:pPr>
+            <w:r>
+              <w:rPr>
+                <w:rFonts w:ascii="Arial" w:cs="Arial" w:eastAsia="Arial" w:hAnsi="Arial"/>
+                <w:b w:val="false"/>
+                <w:bCs w:val="false"/>
+                <w:sz w:val="19"/>
+                <w:szCs w:val="19"/>
+              </w:rPr>
+              <w:t xml:space="preserve">השבתה/הפעלה מחדש + חסימת התחברות</w:t>
+            </w:r>
+          </w:p>
+        </w:tc>
+        <w:tc>
+          <w:tcPr>
+            <w:tcW w:type="dxa" w:w="3200"/>
+            <w:shd w:fill="F2F6FA" w:val="clear"/>
+            <w:tcMar>
+              <w:top w:type="dxa" w:w="60"/>
+              <w:left w:type="dxa" w:w="90"/>
+              <w:bottom w:type="dxa" w:w="60"/>
+              <w:right w:type="dxa" w:w="90"/>
+            </w:tcMar>
+            <w:vAlign w:val="center"/>
+          </w:tcPr>
+          <w:p>
+            <w:pPr>
+              <w:bidi/>
+              <w:spacing w:after="0"/>
+              <w:jc w:val="right"/>
+            </w:pPr>
+            <w:r>
+              <w:rPr>
+                <w:rFonts w:ascii="Arial" w:cs="Arial" w:eastAsia="Arial" w:hAnsi="Arial"/>
+                <w:b w:val="false"/>
+                <w:bCs w:val="false"/>
+                <w:sz w:val="19"/>
+                <w:szCs w:val="19"/>
+              </w:rPr>
+              <w:t xml:space="preserve">אפיון עסקי 25.6; API חלק ג׳ 4.4.4, 4.4.6</w:t>
+            </w:r>
+          </w:p>
+        </w:tc>
+        <w:tc>
+          <w:tcPr>
+            <w:tcW w:type="dxa" w:w="1900"/>
+            <w:shd w:fill="F2F6FA" w:val="clear"/>
+            <w:tcMar>
+              <w:top w:type="dxa" w:w="60"/>
+              <w:left w:type="dxa" w:w="90"/>
+              <w:bottom w:type="dxa" w:w="60"/>
+              <w:right w:type="dxa" w:w="90"/>
+            </w:tcMar>
+            <w:vAlign w:val="center"/>
+          </w:tcPr>
+          <w:p>
+            <w:pPr>
+              <w:bidi/>
+              <w:spacing w:after="0"/>
+              <w:jc w:val="right"/>
+            </w:pPr>
+            <w:r>
+              <w:rPr>
+                <w:rFonts w:ascii="Arial" w:cs="Arial" w:eastAsia="Arial" w:hAnsi="Arial"/>
+                <w:b w:val="false"/>
+                <w:bCs w:val="false"/>
+                <w:sz w:val="19"/>
+                <w:szCs w:val="19"/>
+              </w:rPr>
+              <w:t xml:space="preserve">FR-180</w:t>
             </w:r>
           </w:p>
         </w:tc>

</xml_diff>